<commit_message>
inicio practica 2 SE
</commit_message>
<xml_diff>
--- a/embebidos/laboratorio/practica1/reporte1_GPIO_ErikGarciaChavez_SE.docx
+++ b/embebidos/laboratorio/practica1/reporte1_GPIO_ErikGarciaChavez_SE.docx
@@ -212,17 +212,15 @@
         </w:rPr>
         <w:t xml:space="preserve">Evangelina </w:t>
       </w:r>
-    </w:p>
-    <w:p>
-      <w:pPr>
-        <w:jc w:val="center"/>
+      <w:r>
         <w:rPr>
           <w:b/>
           <w:bCs/>
           <w:sz w:val="32"/>
           <w:szCs w:val="32"/>
         </w:rPr>
-      </w:pPr>
+        <w:t>Lara Camacho</w:t>
+      </w:r>
     </w:p>
     <w:p>
       <w:pPr>
@@ -234,16 +232,17 @@
           <w:szCs w:val="32"/>
         </w:rPr>
       </w:pPr>
-      <w:r>
+    </w:p>
+    <w:p>
+      <w:pPr>
+        <w:jc w:val="center"/>
         <w:rPr>
           <w:b/>
           <w:bCs/>
           <w:sz w:val="32"/>
           <w:szCs w:val="32"/>
         </w:rPr>
-        <w:t xml:space="preserve">Erik garcia </w:t>
-      </w:r>
-      <w:proofErr w:type="spellStart"/>
+      </w:pPr>
       <w:r>
         <w:rPr>
           <w:b/>
@@ -251,17 +250,7 @@
           <w:sz w:val="32"/>
           <w:szCs w:val="32"/>
         </w:rPr>
-        <w:t>chavez</w:t>
-      </w:r>
-      <w:proofErr w:type="spellEnd"/>
-      <w:r>
-        <w:rPr>
-          <w:b/>
-          <w:bCs/>
-          <w:sz w:val="32"/>
-          <w:szCs w:val="32"/>
-        </w:rPr>
-        <w:t xml:space="preserve"> 01275863</w:t>
+        <w:t>Erik garcia chavez 01275863</w:t>
       </w:r>
     </w:p>
     <w:p>
@@ -313,16 +302,10 @@
           <w:numId w:val="1"/>
         </w:numPr>
       </w:pPr>
-      <w:proofErr w:type="spellStart"/>
       <w:r>
         <w:lastRenderedPageBreak/>
-        <w:t>Teoria</w:t>
-      </w:r>
-      <w:proofErr w:type="spellEnd"/>
-      <w:r>
-        <w:t xml:space="preserve">: describa la función de </w:t>
-      </w:r>
-      <w:proofErr w:type="spellStart"/>
+        <w:t xml:space="preserve">Teoria: describa la función de </w:t>
+      </w:r>
       <w:r>
         <w:rPr>
           <w:i/>
@@ -330,19 +313,10 @@
         </w:rPr>
         <w:t>gpio_dump_io_configuration</w:t>
       </w:r>
-      <w:proofErr w:type="spellEnd"/>
-    </w:p>
-    <w:p>
-      <w:r>
-        <w:t xml:space="preserve">Esta función nos proporciona </w:t>
-      </w:r>
-      <w:proofErr w:type="spellStart"/>
-      <w:r>
-        <w:t>infromacion</w:t>
-      </w:r>
-      <w:proofErr w:type="spellEnd"/>
-      <w:r>
-        <w:t xml:space="preserve"> detallada sobre la configuración actual de todos los pines GPIO del microcontrolador. </w:t>
+    </w:p>
+    <w:p>
+      <w:r>
+        <w:t xml:space="preserve">Esta función nos proporciona infromacion detallada sobre la configuración actual de todos los pines GPIO del microcontrolador. </w:t>
       </w:r>
     </w:p>
     <w:p>
@@ -361,44 +335,19 @@
           <w:i/>
           <w:iCs/>
         </w:rPr>
-        <w:t>#include “drivers/</w:t>
-      </w:r>
-      <w:proofErr w:type="spellStart"/>
-      <w:r>
-        <w:rPr>
-          <w:b/>
-          <w:bCs/>
-          <w:i/>
-          <w:iCs/>
-        </w:rPr>
-        <w:t>gpio.h</w:t>
-      </w:r>
-      <w:proofErr w:type="spellEnd"/>
-      <w:r>
-        <w:rPr>
-          <w:b/>
-          <w:bCs/>
-          <w:i/>
-          <w:iCs/>
-        </w:rPr>
-        <w:t xml:space="preserve">” </w:t>
-      </w:r>
-    </w:p>
-    <w:p>
-      <w:r>
-        <w:t xml:space="preserve">Un ejemplo de salida </w:t>
-      </w:r>
-      <w:proofErr w:type="spellStart"/>
-      <w:r>
-        <w:t>podira</w:t>
-      </w:r>
-      <w:proofErr w:type="spellEnd"/>
-      <w:r>
-        <w:t xml:space="preserve"> ser: </w:t>
-      </w:r>
-    </w:p>
-    <w:p>
-      <w:r>
+        <w:t xml:space="preserve">#include “drivers/gpio.h” </w:t>
+      </w:r>
+    </w:p>
+    <w:p>
+      <w:r>
+        <w:t xml:space="preserve">Un ejemplo de salida podira ser: </w:t>
+      </w:r>
+    </w:p>
+    <w:p>
+      <w:r>
+        <w:rPr>
+          <w:noProof/>
+        </w:rPr>
         <w:drawing>
           <wp:inline distT="0" distB="0" distL="0" distR="0" wp14:anchorId="22C9B01A" wp14:editId="1D356D78">
             <wp:extent cx="3907127" cy="2415540"/>
@@ -440,269 +389,106 @@
       <w:r>
         <w:t xml:space="preserve">Esta es una salida real la función </w:t>
       </w:r>
-      <w:proofErr w:type="spellStart"/>
       <w:r>
         <w:rPr>
           <w:i/>
           <w:iCs/>
         </w:rPr>
-        <w:t>gpio_dump_io_</w:t>
-      </w:r>
-      <w:proofErr w:type="gramStart"/>
-      <w:r>
-        <w:rPr>
-          <w:i/>
-          <w:iCs/>
-        </w:rPr>
-        <w:t>configuration</w:t>
-      </w:r>
-      <w:proofErr w:type="spellEnd"/>
-      <w:r>
-        <w:rPr>
-          <w:i/>
-          <w:iCs/>
-        </w:rPr>
-        <w:t>(</w:t>
-      </w:r>
-      <w:proofErr w:type="gramEnd"/>
-      <w:r>
-        <w:rPr>
-          <w:i/>
-          <w:iCs/>
-        </w:rPr>
-        <w:t xml:space="preserve">) </w:t>
-      </w:r>
-      <w:r>
-        <w:t xml:space="preserve">mateado sobre los </w:t>
-      </w:r>
-      <w:proofErr w:type="spellStart"/>
-      <w:r>
-        <w:t>GPIO’s</w:t>
-      </w:r>
-      <w:proofErr w:type="spellEnd"/>
-      <w:r>
-        <w:t xml:space="preserve"> 4,18 y 26. </w:t>
-      </w:r>
-    </w:p>
-    <w:p>
-      <w:r>
-        <w:t xml:space="preserve">Lo que nos esta mostrando es la configuración de cada GPIO, tenemos </w:t>
-      </w:r>
-      <w:proofErr w:type="spellStart"/>
-      <w:r>
-        <w:t>infromacion</w:t>
-      </w:r>
-      <w:proofErr w:type="spellEnd"/>
-      <w:r>
-        <w:t xml:space="preserve"> como </w:t>
-      </w:r>
-    </w:p>
-    <w:p>
-      <w:pPr>
-        <w:rPr>
-          <w:lang w:val="en-US"/>
-        </w:rPr>
-      </w:pPr>
-      <w:r>
-        <w:rPr>
-          <w:lang w:val="en-US"/>
-        </w:rPr>
+        <w:t xml:space="preserve">gpio_dump_io_configuration() </w:t>
+      </w:r>
+      <w:r>
+        <w:t xml:space="preserve">mateado sobre los GPIO’s 4,18 y 26. </w:t>
+      </w:r>
+    </w:p>
+    <w:p>
+      <w:r>
+        <w:t xml:space="preserve">Lo que nos esta mostrando es la configuración de cada GPIO, tenemos infromacion como </w:t>
+      </w:r>
+    </w:p>
+    <w:p>
+      <w:r>
         <w:t>-</w:t>
       </w:r>
       <w:r>
         <w:rPr>
           <w:b/>
           <w:bCs/>
-          <w:lang w:val="en-US"/>
-        </w:rPr>
-        <w:t xml:space="preserve">pullup </w:t>
-      </w:r>
-      <w:proofErr w:type="spellStart"/>
-      <w:r>
-        <w:rPr>
-          <w:b/>
-          <w:bCs/>
-          <w:lang w:val="en-US"/>
-        </w:rPr>
-        <w:t>activado</w:t>
-      </w:r>
-      <w:proofErr w:type="spellEnd"/>
-      <w:r>
-        <w:rPr>
-          <w:b/>
-          <w:bCs/>
-          <w:lang w:val="en-US"/>
+        </w:rPr>
+        <w:t xml:space="preserve">pullup activado </w:t>
+      </w:r>
+      <w:r>
+        <w:t>(pullup – 1 : pulldown: 0)</w:t>
+      </w:r>
+    </w:p>
+    <w:p>
+      <w:r>
+        <w:t>-</w:t>
+      </w:r>
+      <w:r>
+        <w:rPr>
+          <w:b/>
+          <w:bCs/>
+        </w:rPr>
+        <w:t>drivecap</w:t>
+      </w:r>
+      <w:r>
+        <w:rPr>
+          <w:b/>
+          <w:bCs/>
         </w:rPr>
         <w:t xml:space="preserve"> </w:t>
       </w:r>
       <w:r>
-        <w:rPr>
-          <w:lang w:val="en-US"/>
-        </w:rPr>
-        <w:t xml:space="preserve">(pullup – </w:t>
-      </w:r>
-      <w:proofErr w:type="gramStart"/>
-      <w:r>
-        <w:rPr>
-          <w:lang w:val="en-US"/>
-        </w:rPr>
-        <w:t>1 :</w:t>
-      </w:r>
-      <w:proofErr w:type="gramEnd"/>
-      <w:r>
-        <w:rPr>
-          <w:lang w:val="en-US"/>
-        </w:rPr>
-        <w:t xml:space="preserve"> pulldown: 0)</w:t>
+        <w:t>(drive capacity nivel 2 - ~20mA)</w:t>
+      </w:r>
+      <w:r>
+        <w:rPr>
+          <w:b/>
+          <w:bCs/>
+        </w:rPr>
+        <w:t xml:space="preserve">: </w:t>
+      </w:r>
+      <w:r>
+        <w:t>es un parametron que</w:t>
+      </w:r>
+      <w:r>
+        <w:t xml:space="preserve"> controla cunata corrinte puede soportar o drenar un pin GPIO</w:t>
+      </w:r>
+      <w:r>
+        <w:t xml:space="preserve">, siendo 2 cercano a los 20mA la configuración estándar. </w:t>
       </w:r>
     </w:p>
     <w:p>
       <w:r>
         <w:t>-</w:t>
       </w:r>
-      <w:proofErr w:type="spellStart"/>
-      <w:r>
-        <w:rPr>
-          <w:b/>
-          <w:bCs/>
-        </w:rPr>
-        <w:t>drivecap</w:t>
-      </w:r>
-      <w:proofErr w:type="spellEnd"/>
-      <w:r>
-        <w:rPr>
-          <w:b/>
-          <w:bCs/>
-        </w:rPr>
-        <w:t xml:space="preserve"> </w:t>
-      </w:r>
-      <w:r>
-        <w:t xml:space="preserve">(drive </w:t>
-      </w:r>
-      <w:proofErr w:type="spellStart"/>
-      <w:r>
-        <w:t>capacity</w:t>
-      </w:r>
-      <w:proofErr w:type="spellEnd"/>
-      <w:r>
-        <w:t xml:space="preserve"> nivel 2 - ~20mA)</w:t>
-      </w:r>
-      <w:r>
-        <w:rPr>
-          <w:b/>
-          <w:bCs/>
-        </w:rPr>
-        <w:t xml:space="preserve">: </w:t>
-      </w:r>
-      <w:r>
-        <w:t xml:space="preserve">es un </w:t>
-      </w:r>
-      <w:proofErr w:type="spellStart"/>
-      <w:r>
-        <w:t>parametron</w:t>
-      </w:r>
-      <w:proofErr w:type="spellEnd"/>
-      <w:r>
-        <w:t xml:space="preserve"> que</w:t>
-      </w:r>
-      <w:r>
-        <w:t xml:space="preserve"> controla </w:t>
-      </w:r>
-      <w:proofErr w:type="spellStart"/>
-      <w:r>
-        <w:t>cunata</w:t>
-      </w:r>
-      <w:proofErr w:type="spellEnd"/>
-      <w:r>
-        <w:t xml:space="preserve"> </w:t>
-      </w:r>
-      <w:proofErr w:type="spellStart"/>
-      <w:r>
-        <w:t>corrinte</w:t>
-      </w:r>
-      <w:proofErr w:type="spellEnd"/>
-      <w:r>
-        <w:t xml:space="preserve"> puede soportar o drenar un pin GPIO</w:t>
-      </w:r>
-      <w:r>
-        <w:t xml:space="preserve">, siendo 2 cercano a los 20mA la configuración estándar. </w:t>
+      <w:r>
+        <w:rPr>
+          <w:b/>
+          <w:bCs/>
+        </w:rPr>
+        <w:t xml:space="preserve">inputEn </w:t>
+      </w:r>
+      <w:r>
+        <w:t xml:space="preserve">configturado como entrada (inputEn : 1, output:0) </w:t>
+      </w:r>
+      <w:r>
+        <w:t xml:space="preserve">nos señala que el GPIO es de entrada </w:t>
       </w:r>
     </w:p>
     <w:p>
       <w:r>
         <w:t>-</w:t>
       </w:r>
-      <w:proofErr w:type="spellStart"/>
-      <w:r>
-        <w:rPr>
-          <w:b/>
-          <w:bCs/>
-        </w:rPr>
-        <w:t>inputEn</w:t>
-      </w:r>
-      <w:proofErr w:type="spellEnd"/>
-      <w:r>
-        <w:rPr>
-          <w:b/>
-          <w:bCs/>
-        </w:rPr>
-        <w:t xml:space="preserve"> </w:t>
-      </w:r>
-      <w:proofErr w:type="spellStart"/>
-      <w:r>
-        <w:t>configturado</w:t>
-      </w:r>
-      <w:proofErr w:type="spellEnd"/>
-      <w:r>
-        <w:t xml:space="preserve"> como entrada (</w:t>
-      </w:r>
-      <w:proofErr w:type="spellStart"/>
-      <w:proofErr w:type="gramStart"/>
-      <w:r>
-        <w:t>inputEn</w:t>
-      </w:r>
-      <w:proofErr w:type="spellEnd"/>
-      <w:r>
-        <w:t xml:space="preserve"> :</w:t>
-      </w:r>
-      <w:proofErr w:type="gramEnd"/>
-      <w:r>
-        <w:t xml:space="preserve"> 1, output:0) </w:t>
-      </w:r>
-      <w:r>
-        <w:t xml:space="preserve">nos señala que el GPIO es de entrada </w:t>
-      </w:r>
-    </w:p>
-    <w:p>
-      <w:r>
-        <w:t>-</w:t>
-      </w:r>
-      <w:proofErr w:type="spellStart"/>
-      <w:r>
-        <w:rPr>
-          <w:b/>
-          <w:bCs/>
-        </w:rPr>
-        <w:t>funcSel</w:t>
-      </w:r>
-      <w:proofErr w:type="spellEnd"/>
-      <w:r>
-        <w:rPr>
-          <w:b/>
-          <w:bCs/>
-        </w:rPr>
-        <w:t xml:space="preserve">: </w:t>
-      </w:r>
-      <w:r>
-        <w:t xml:space="preserve">1 (indica que función </w:t>
-      </w:r>
-      <w:proofErr w:type="spellStart"/>
-      <w:r>
-        <w:t>decempenia</w:t>
-      </w:r>
-      <w:proofErr w:type="spellEnd"/>
-      <w:r>
-        <w:t xml:space="preserve"> en este caso como GPIO, pero tenemos como el caso del PIN 26 de uso directo del multiplexo I/O que es 0 y de 2-5 funciones alternativas.)</w:t>
+      <w:r>
+        <w:rPr>
+          <w:b/>
+          <w:bCs/>
+        </w:rPr>
+        <w:t xml:space="preserve">funcSel: </w:t>
+      </w:r>
+      <w:r>
+        <w:t>1 (indica que función decempenia en este caso como GPIO, pero tenemos como el caso del PIN 26 de uso directo del multiplexo I/O que es 0 y de 2-5 funciones alternativas.)</w:t>
       </w:r>
     </w:p>
     <w:p>
@@ -716,83 +502,18 @@
         <w:lastRenderedPageBreak/>
         <w:t>-</w:t>
       </w:r>
-      <w:proofErr w:type="spellStart"/>
-      <w:r>
-        <w:rPr>
-          <w:b/>
-          <w:bCs/>
-        </w:rPr>
-        <w:t>sleepSelEn</w:t>
-      </w:r>
-      <w:proofErr w:type="spellEnd"/>
-      <w:r>
-        <w:rPr>
-          <w:b/>
-          <w:bCs/>
-        </w:rPr>
-        <w:t>: 1 (</w:t>
-      </w:r>
-      <w:r>
-        <w:t xml:space="preserve">este parámetro indica si la configuración se mantiene durante el Deep </w:t>
-      </w:r>
-      <w:proofErr w:type="spellStart"/>
-      <w:r>
-        <w:t>sleep</w:t>
-      </w:r>
-      <w:proofErr w:type="spellEnd"/>
-      <w:r>
-        <w:t xml:space="preserve">, cunado </w:t>
-      </w:r>
-      <w:proofErr w:type="spellStart"/>
-      <w:r>
-        <w:t>esta</w:t>
-      </w:r>
-      <w:proofErr w:type="spellEnd"/>
-      <w:r>
-        <w:t xml:space="preserve"> en 1, tanto </w:t>
-      </w:r>
-      <w:proofErr w:type="spellStart"/>
-      <w:r>
-        <w:t>pull</w:t>
-      </w:r>
-      <w:proofErr w:type="spellEnd"/>
-      <w:r>
-        <w:t>-up</w:t>
-      </w:r>
-      <w:r>
-        <w:t>s/</w:t>
-      </w:r>
-      <w:proofErr w:type="spellStart"/>
-      <w:r>
-        <w:t>pull-down</w:t>
-      </w:r>
-      <w:proofErr w:type="spellEnd"/>
-      <w:r>
-        <w:t xml:space="preserve">/ </w:t>
-      </w:r>
-      <w:proofErr w:type="spellStart"/>
-      <w:r>
-        <w:t>configuracion</w:t>
-      </w:r>
-      <w:proofErr w:type="spellEnd"/>
-      <w:r>
-        <w:t xml:space="preserve"> de los </w:t>
-      </w:r>
-      <w:proofErr w:type="spellStart"/>
-      <w:r>
-        <w:t>GPIO’s</w:t>
-      </w:r>
-      <w:proofErr w:type="spellEnd"/>
-      <w:r>
-        <w:t xml:space="preserve"> se </w:t>
-      </w:r>
-      <w:proofErr w:type="gramStart"/>
-      <w:r>
-        <w:t>mantiene</w:t>
-      </w:r>
-      <w:proofErr w:type="gramEnd"/>
-      <w:r>
-        <w:t xml:space="preserve"> pero en el caso que sea </w:t>
+      <w:r>
+        <w:rPr>
+          <w:b/>
+          <w:bCs/>
+        </w:rPr>
+        <w:t>sleepSelEn: 1 (</w:t>
+      </w:r>
+      <w:r>
+        <w:t>este parámetro indica si la configuración se mantiene durante el Deep sleep, cunado esta en 1, tanto pull-up</w:t>
+      </w:r>
+      <w:r>
+        <w:t xml:space="preserve">s/pull-down/ configuracion de los GPIO’s se mantiene pero en el caso que sea </w:t>
       </w:r>
       <w:r>
         <w:rPr>
@@ -802,13 +523,8 @@
         <w:t xml:space="preserve">0 </w:t>
       </w:r>
       <w:r>
-        <w:t xml:space="preserve">estos se </w:t>
-      </w:r>
-      <w:proofErr w:type="spellStart"/>
-      <w:r>
-        <w:t>recetean</w:t>
-      </w:r>
-      <w:proofErr w:type="spellEnd"/>
+        <w:t>estos se recetean</w:t>
+      </w:r>
       <w:r>
         <w:rPr>
           <w:b/>
@@ -844,23 +560,7 @@
           <w:b/>
           <w:bCs/>
         </w:rPr>
-        <w:t xml:space="preserve">-desarrollo de la </w:t>
-      </w:r>
-      <w:proofErr w:type="spellStart"/>
-      <w:r>
-        <w:rPr>
-          <w:b/>
-          <w:bCs/>
-        </w:rPr>
-        <w:t>paractica</w:t>
-      </w:r>
-      <w:proofErr w:type="spellEnd"/>
-      <w:r>
-        <w:rPr>
-          <w:b/>
-          <w:bCs/>
-        </w:rPr>
-        <w:t xml:space="preserve"> </w:t>
+        <w:t xml:space="preserve">-desarrollo de la paractica </w:t>
       </w:r>
     </w:p>
     <w:p>
@@ -879,244 +579,13 @@
       </w:r>
     </w:p>
     <w:p>
-      <w:proofErr w:type="spellStart"/>
-      <w:r>
-        <w:t>Uná</w:t>
-      </w:r>
-      <w:proofErr w:type="spellEnd"/>
-      <w:r>
-        <w:t xml:space="preserve"> </w:t>
-      </w:r>
-      <w:proofErr w:type="spellStart"/>
-      <w:r>
-        <w:t>plázá</w:t>
-      </w:r>
-      <w:proofErr w:type="spellEnd"/>
-      <w:r>
-        <w:t xml:space="preserve"> </w:t>
-      </w:r>
-      <w:proofErr w:type="spellStart"/>
-      <w:r>
-        <w:t>comerciál</w:t>
-      </w:r>
-      <w:proofErr w:type="spellEnd"/>
-      <w:r>
-        <w:t xml:space="preserve"> </w:t>
-      </w:r>
-      <w:proofErr w:type="spellStart"/>
-      <w:r>
-        <w:t>cobrá</w:t>
-      </w:r>
-      <w:proofErr w:type="spellEnd"/>
-      <w:r>
-        <w:t xml:space="preserve"> 15 pesos por el uso de su </w:t>
-      </w:r>
-      <w:proofErr w:type="spellStart"/>
-      <w:r>
-        <w:t>estácionámiento</w:t>
-      </w:r>
-      <w:proofErr w:type="spellEnd"/>
-      <w:r>
-        <w:t xml:space="preserve">. </w:t>
-      </w:r>
-      <w:proofErr w:type="gramStart"/>
-      <w:r>
-        <w:t>Cuándo</w:t>
-      </w:r>
-      <w:proofErr w:type="gramEnd"/>
-      <w:r>
-        <w:t xml:space="preserve"> un conductor</w:t>
-      </w:r>
-      <w:r>
-        <w:t xml:space="preserve"> </w:t>
-      </w:r>
-      <w:r>
-        <w:t xml:space="preserve">quiere </w:t>
-      </w:r>
-      <w:proofErr w:type="spellStart"/>
-      <w:r>
-        <w:t>retirár</w:t>
-      </w:r>
-      <w:proofErr w:type="spellEnd"/>
-      <w:r>
-        <w:t xml:space="preserve"> su vehículo, </w:t>
-      </w:r>
-      <w:proofErr w:type="spellStart"/>
-      <w:r>
-        <w:t>págá</w:t>
-      </w:r>
-      <w:proofErr w:type="spellEnd"/>
-      <w:r>
-        <w:t xml:space="preserve"> ese monto por medio de </w:t>
-      </w:r>
-      <w:proofErr w:type="spellStart"/>
-      <w:r>
-        <w:t>uná</w:t>
-      </w:r>
-      <w:proofErr w:type="spellEnd"/>
-      <w:r>
-        <w:t xml:space="preserve"> </w:t>
-      </w:r>
-      <w:proofErr w:type="spellStart"/>
-      <w:r>
-        <w:t>máquiná</w:t>
-      </w:r>
-      <w:proofErr w:type="spellEnd"/>
-      <w:r>
-        <w:t xml:space="preserve"> </w:t>
-      </w:r>
-      <w:proofErr w:type="spellStart"/>
-      <w:r>
-        <w:t>expendedorá</w:t>
-      </w:r>
-      <w:proofErr w:type="spellEnd"/>
-      <w:r>
-        <w:t>, está le</w:t>
-      </w:r>
-      <w:r>
-        <w:t xml:space="preserve"> </w:t>
-      </w:r>
-      <w:r>
-        <w:t xml:space="preserve">provee el recibo de </w:t>
-      </w:r>
-      <w:proofErr w:type="spellStart"/>
-      <w:r>
-        <w:t>págo</w:t>
-      </w:r>
-      <w:proofErr w:type="spellEnd"/>
-      <w:r>
-        <w:t xml:space="preserve"> que el conductor </w:t>
-      </w:r>
-      <w:proofErr w:type="spellStart"/>
-      <w:r>
-        <w:t>despues</w:t>
-      </w:r>
-      <w:proofErr w:type="spellEnd"/>
-      <w:r>
-        <w:t xml:space="preserve"> </w:t>
-      </w:r>
-      <w:proofErr w:type="spellStart"/>
-      <w:r>
-        <w:t>ingresá</w:t>
-      </w:r>
-      <w:proofErr w:type="spellEnd"/>
-      <w:r>
-        <w:t xml:space="preserve"> en </w:t>
-      </w:r>
-      <w:proofErr w:type="spellStart"/>
-      <w:r>
-        <w:t>lá</w:t>
-      </w:r>
-      <w:proofErr w:type="spellEnd"/>
-      <w:r>
-        <w:t xml:space="preserve"> </w:t>
-      </w:r>
-      <w:proofErr w:type="spellStart"/>
-      <w:r>
-        <w:t>bárrerá</w:t>
-      </w:r>
-      <w:proofErr w:type="spellEnd"/>
-      <w:r>
-        <w:t xml:space="preserve"> de control </w:t>
-      </w:r>
-      <w:r>
-        <w:t xml:space="preserve">vehicular </w:t>
-      </w:r>
-      <w:proofErr w:type="spellStart"/>
-      <w:r>
-        <w:t>párá</w:t>
-      </w:r>
-      <w:proofErr w:type="spellEnd"/>
-      <w:r>
-        <w:t xml:space="preserve"> poder </w:t>
-      </w:r>
-      <w:proofErr w:type="spellStart"/>
-      <w:r>
-        <w:t>sálir</w:t>
-      </w:r>
-      <w:proofErr w:type="spellEnd"/>
-      <w:r>
-        <w:t xml:space="preserve"> de </w:t>
-      </w:r>
-      <w:proofErr w:type="spellStart"/>
-      <w:r>
-        <w:t>lá</w:t>
-      </w:r>
-      <w:proofErr w:type="spellEnd"/>
-      <w:r>
-        <w:t xml:space="preserve"> </w:t>
-      </w:r>
-      <w:proofErr w:type="spellStart"/>
-      <w:r>
-        <w:t>plázá</w:t>
-      </w:r>
-      <w:proofErr w:type="spellEnd"/>
-      <w:r>
-        <w:t xml:space="preserve">. </w:t>
-      </w:r>
-      <w:proofErr w:type="spellStart"/>
-      <w:r>
-        <w:t>Lá</w:t>
-      </w:r>
-      <w:proofErr w:type="spellEnd"/>
-      <w:r>
-        <w:t xml:space="preserve"> </w:t>
-      </w:r>
-      <w:proofErr w:type="spellStart"/>
-      <w:r>
-        <w:t>máquiná</w:t>
-      </w:r>
-      <w:proofErr w:type="spellEnd"/>
-      <w:r>
-        <w:t xml:space="preserve"> </w:t>
-      </w:r>
-      <w:proofErr w:type="spellStart"/>
-      <w:r>
-        <w:t>expendedorá</w:t>
-      </w:r>
-      <w:proofErr w:type="spellEnd"/>
-      <w:r>
-        <w:t xml:space="preserve"> solo permite el </w:t>
-      </w:r>
-      <w:proofErr w:type="spellStart"/>
-      <w:r>
-        <w:t>págo</w:t>
-      </w:r>
-      <w:proofErr w:type="spellEnd"/>
-      <w:r>
-        <w:t xml:space="preserve"> con </w:t>
-      </w:r>
-      <w:proofErr w:type="spellStart"/>
-      <w:r>
-        <w:t>monedás</w:t>
-      </w:r>
-      <w:proofErr w:type="spellEnd"/>
-      <w:r>
-        <w:t xml:space="preserve"> de 1, 5,</w:t>
-      </w:r>
-      <w:r>
-        <w:t xml:space="preserve"> </w:t>
-      </w:r>
-      <w:r>
-        <w:t>10 y 20 pesos.</w:t>
-      </w:r>
-    </w:p>
-    <w:p>
-      <w:proofErr w:type="spellStart"/>
-      <w:r>
-        <w:t>Disenie</w:t>
-      </w:r>
-      <w:proofErr w:type="spellEnd"/>
-      <w:r>
-        <w:t xml:space="preserve"> una </w:t>
-      </w:r>
-      <w:proofErr w:type="spellStart"/>
-      <w:r>
-        <w:t>mauina</w:t>
-      </w:r>
-      <w:proofErr w:type="spellEnd"/>
-      <w:r>
-        <w:t xml:space="preserve"> de estado que implemente el comportamiento de la maquina expendedora de recibos. </w:t>
+      <w:r>
+        <w:t>Uná plázá comerciál cobrá 15 pesos por el uso de su estácionámiento. Cuándo un conductor quiere retirár su vehículo, págá ese monto por medio de uná máquiná expendedorá, está le provee el recibo de págo que el conductor despues ingresá en lá bárrerá de control vehicular párá poder sálir de lá plázá. Lá máquiná expendedorá solo permite el págo con monedás de 1, 5, 10 y 20 pesos.</w:t>
+      </w:r>
+    </w:p>
+    <w:p>
+      <w:r>
+        <w:t xml:space="preserve">Disenie una mauina de estado que implemente el comportamiento de la maquina expendedora de recibos. </w:t>
       </w:r>
     </w:p>
     <w:p>
@@ -1145,15 +614,7 @@
         </w:numPr>
       </w:pPr>
       <w:r>
-        <w:t xml:space="preserve">Estado donde se insertan </w:t>
-      </w:r>
-      <w:proofErr w:type="spellStart"/>
-      <w:r>
-        <w:t>modendas</w:t>
-      </w:r>
-      <w:proofErr w:type="spellEnd"/>
-      <w:r>
-        <w:t xml:space="preserve"> de 1 peso</w:t>
+        <w:t>Estado donde se insertan modendas de 1 peso</w:t>
       </w:r>
     </w:p>
     <w:p>
@@ -1188,13 +649,8 @@
           <w:numId w:val="1"/>
         </w:numPr>
       </w:pPr>
-      <w:proofErr w:type="spellStart"/>
-      <w:r>
-        <w:t>Mondeas</w:t>
-      </w:r>
-      <w:proofErr w:type="spellEnd"/>
-      <w:r>
-        <w:t xml:space="preserve"> donde se inserta monedas de 20 pesos </w:t>
+      <w:r>
+        <w:t xml:space="preserve">Mondeas donde se inserta monedas de 20 pesos </w:t>
       </w:r>
     </w:p>
     <w:p>
@@ -1223,6 +679,9 @@
     </w:p>
     <w:p>
       <w:r>
+        <w:rPr>
+          <w:noProof/>
+        </w:rPr>
         <w:lastRenderedPageBreak/>
         <w:drawing>
           <wp:inline distT="0" distB="0" distL="0" distR="0" wp14:anchorId="2CC537E8" wp14:editId="071F3DA6">
@@ -1274,23 +733,7 @@
           <w:b/>
           <w:bCs/>
         </w:rPr>
-        <w:t xml:space="preserve">Simulación en </w:t>
-      </w:r>
-      <w:proofErr w:type="spellStart"/>
-      <w:r>
-        <w:rPr>
-          <w:b/>
-          <w:bCs/>
-        </w:rPr>
-        <w:t>wokwi</w:t>
-      </w:r>
-      <w:proofErr w:type="spellEnd"/>
-      <w:r>
-        <w:rPr>
-          <w:b/>
-          <w:bCs/>
-        </w:rPr>
-        <w:t xml:space="preserve">: </w:t>
+        <w:t xml:space="preserve">Simulación en wokwi: </w:t>
       </w:r>
     </w:p>
     <w:p>
@@ -1300,6 +743,9 @@
     </w:p>
     <w:p>
       <w:r>
+        <w:rPr>
+          <w:noProof/>
+        </w:rPr>
         <w:drawing>
           <wp:inline distT="0" distB="0" distL="0" distR="0" wp14:anchorId="38ACDC3D" wp14:editId="0D6EF2F3">
             <wp:extent cx="5612130" cy="2416810"/>
@@ -1359,6 +805,9 @@
     </w:p>
     <w:p>
       <w:r>
+        <w:rPr>
+          <w:noProof/>
+        </w:rPr>
         <w:drawing>
           <wp:inline distT="0" distB="0" distL="0" distR="0" wp14:anchorId="22D6FA15" wp14:editId="6CD656EC">
             <wp:extent cx="5612130" cy="2449195"/>
@@ -1398,15 +847,7 @@
     </w:p>
     <w:p>
       <w:r>
-        <w:t xml:space="preserve">En la parte de abajo indico </w:t>
-      </w:r>
-      <w:proofErr w:type="gramStart"/>
-      <w:r>
-        <w:t>cuanto falta</w:t>
-      </w:r>
-      <w:proofErr w:type="gramEnd"/>
-      <w:r>
-        <w:t xml:space="preserve"> en caso de que no se hayan completado los 15 pesos y el dinero acumulado.</w:t>
+        <w:t>En la parte de abajo indico cuanto falta en caso de que no se hayan completado los 15 pesos y el dinero acumulado.</w:t>
       </w:r>
     </w:p>
     <w:p>
@@ -1426,6 +867,9 @@
     </w:p>
     <w:p>
       <w:r>
+        <w:rPr>
+          <w:noProof/>
+        </w:rPr>
         <w:drawing>
           <wp:inline distT="0" distB="0" distL="0" distR="0" wp14:anchorId="071DEB53" wp14:editId="103876DE">
             <wp:extent cx="5612130" cy="2437765"/>
@@ -1496,6 +940,7 @@
         <w:rPr>
           <w:b/>
           <w:bCs/>
+          <w:noProof/>
         </w:rPr>
         <w:drawing>
           <wp:inline distT="0" distB="0" distL="0" distR="0" wp14:anchorId="6F30945A" wp14:editId="3ED83A49">
@@ -1536,16 +981,11 @@
     </w:p>
     <w:p>
       <w:r>
-        <w:t xml:space="preserve">El cambio esta representado por los leds del lado izquierdo en donde el led morado representa los de 10 pesos, el led verde de 5 y el led rojo de 1, el led azul representa </w:t>
-      </w:r>
-      <w:proofErr w:type="gramStart"/>
-      <w:r>
-        <w:t xml:space="preserve">el </w:t>
+        <w:t xml:space="preserve">El cambio esta representado por los leds del lado izquierdo en donde el led morado representa los de 10 pesos, el led verde de 5 y el led rojo de 1, el led azul representa el </w:t>
       </w:r>
       <w:r>
         <w:t>impresión</w:t>
       </w:r>
-      <w:proofErr w:type="gramEnd"/>
       <w:r>
         <w:t xml:space="preserve"> del boleto, en este caso se esta dado 1 peso de cambio. </w:t>
       </w:r>
@@ -1581,6 +1021,9 @@
     </w:p>
     <w:p>
       <w:r>
+        <w:rPr>
+          <w:noProof/>
+        </w:rPr>
         <w:drawing>
           <wp:inline distT="0" distB="0" distL="0" distR="0" wp14:anchorId="1159061C" wp14:editId="329B420F">
             <wp:extent cx="4520561" cy="3721100"/>
@@ -1620,26 +1063,10 @@
     </w:p>
     <w:p>
       <w:r>
-        <w:t xml:space="preserve">Cada estado de led se mantiene </w:t>
-      </w:r>
-      <w:proofErr w:type="spellStart"/>
-      <w:r>
-        <w:t>asi</w:t>
-      </w:r>
-      <w:proofErr w:type="spellEnd"/>
-      <w:r>
-        <w:t xml:space="preserve"> prendido por 2 segundos </w:t>
-      </w:r>
-      <w:r>
-        <w:t xml:space="preserve">para poderlo </w:t>
-      </w:r>
-      <w:proofErr w:type="spellStart"/>
-      <w:r>
-        <w:t>visualrslo</w:t>
-      </w:r>
-      <w:proofErr w:type="spellEnd"/>
-      <w:r>
-        <w:t xml:space="preserve"> correctamente. </w:t>
+        <w:t xml:space="preserve">Cada estado de led se mantiene asi prendido por 2 segundos </w:t>
+      </w:r>
+      <w:r>
+        <w:t xml:space="preserve">para poderlo visualrslo correctamente. </w:t>
       </w:r>
     </w:p>
     <w:p/>
@@ -1674,6 +1101,9 @@
     </w:p>
     <w:p>
       <w:r>
+        <w:rPr>
+          <w:noProof/>
+        </w:rPr>
         <w:drawing>
           <wp:inline distT="0" distB="0" distL="0" distR="0" wp14:anchorId="2FEEF8C5" wp14:editId="45BB4A8B">
             <wp:extent cx="3922812" cy="3465195"/>
@@ -1742,6 +1172,7 @@
         <w:rPr>
           <w:b/>
           <w:bCs/>
+          <w:noProof/>
         </w:rPr>
         <w:drawing>
           <wp:inline distT="0" distB="0" distL="0" distR="0" wp14:anchorId="389CD29E" wp14:editId="7DEDDEAE">
@@ -1801,48 +1232,19 @@
           <w:bCs/>
         </w:rPr>
         <w:lastRenderedPageBreak/>
-        <w:t xml:space="preserve">-cambio de </w:t>
-      </w:r>
-      <w:proofErr w:type="spellStart"/>
-      <w:r>
-        <w:rPr>
-          <w:b/>
-          <w:bCs/>
-        </w:rPr>
-        <w:t>mas</w:t>
-      </w:r>
-      <w:proofErr w:type="spellEnd"/>
-      <w:r>
-        <w:rPr>
-          <w:b/>
-          <w:bCs/>
-        </w:rPr>
-        <w:t xml:space="preserve">: </w:t>
-      </w:r>
-    </w:p>
-    <w:p>
-      <w:r>
-        <w:t xml:space="preserve">Puede dar cambio diferente a 1 peso o 5, por </w:t>
-      </w:r>
-      <w:proofErr w:type="gramStart"/>
-      <w:r>
-        <w:t>ejemplo</w:t>
-      </w:r>
-      <w:proofErr w:type="gramEnd"/>
-      <w:r>
-        <w:t xml:space="preserve"> si se inserta 10, requiere 5 mas pero si inserto 20 </w:t>
-      </w:r>
-      <w:proofErr w:type="spellStart"/>
-      <w:r>
-        <w:t>deberian</w:t>
-      </w:r>
-      <w:proofErr w:type="spellEnd"/>
-      <w:r>
-        <w:t xml:space="preserve"> de darme 15 pesos de cambio lo cual podemos ver en la siguiente representación. </w:t>
-      </w:r>
-    </w:p>
-    <w:p>
-      <w:r>
+        <w:t xml:space="preserve">-cambio de mas: </w:t>
+      </w:r>
+    </w:p>
+    <w:p>
+      <w:r>
+        <w:t xml:space="preserve">Puede dar cambio diferente a 1 peso o 5, por ejemplo si se inserta 10, requiere 5 mas pero si inserto 20 deberian de darme 15 pesos de cambio lo cual podemos ver en la siguiente representación. </w:t>
+      </w:r>
+    </w:p>
+    <w:p>
+      <w:r>
+        <w:rPr>
+          <w:noProof/>
+        </w:rPr>
         <w:drawing>
           <wp:inline distT="0" distB="0" distL="0" distR="0" wp14:anchorId="4100B7FD" wp14:editId="24C3706D">
             <wp:extent cx="3688080" cy="3219872"/>
@@ -1882,6 +1284,9 @@
     </w:p>
     <w:p>
       <w:r>
+        <w:rPr>
+          <w:noProof/>
+        </w:rPr>
         <w:drawing>
           <wp:inline distT="0" distB="0" distL="0" distR="0" wp14:anchorId="584E59A4" wp14:editId="4C9B7E86">
             <wp:extent cx="3862362" cy="3352800"/>
@@ -1925,17 +1330,15 @@
         <w:lastRenderedPageBreak/>
         <w:t xml:space="preserve">Hay 30 pesos acumulados por lo que el cambio es 15, primero imprime los de mayor denominación en este caso 10 pesos </w:t>
       </w:r>
-      <w:proofErr w:type="spellStart"/>
-      <w:r>
-        <w:t>repsentado</w:t>
-      </w:r>
-      <w:proofErr w:type="spellEnd"/>
-      <w:r>
-        <w:t xml:space="preserve"> por el led morado </w:t>
-      </w:r>
-    </w:p>
-    <w:p>
-      <w:r>
+      <w:r>
+        <w:t xml:space="preserve">repsentado por el led morado </w:t>
+      </w:r>
+    </w:p>
+    <w:p>
+      <w:r>
+        <w:rPr>
+          <w:noProof/>
+        </w:rPr>
         <w:drawing>
           <wp:inline distT="0" distB="0" distL="0" distR="0" wp14:anchorId="66A79896" wp14:editId="75073A7D">
             <wp:extent cx="3408680" cy="2972856"/>
@@ -1986,6 +1389,9 @@
     </w:p>
     <w:p>
       <w:r>
+        <w:rPr>
+          <w:noProof/>
+        </w:rPr>
         <w:drawing>
           <wp:inline distT="0" distB="0" distL="0" distR="0" wp14:anchorId="5CE19626" wp14:editId="0B52152A">
             <wp:extent cx="3700308" cy="3364107"/>
@@ -2107,23 +1513,7 @@
           <w:i/>
           <w:iCs/>
         </w:rPr>
-        <w:t xml:space="preserve">6 </w:t>
-      </w:r>
-      <w:proofErr w:type="spellStart"/>
-      <w:r>
-        <w:rPr>
-          <w:i/>
-          <w:iCs/>
-        </w:rPr>
-        <w:t>push</w:t>
-      </w:r>
-      <w:proofErr w:type="spellEnd"/>
-      <w:r>
-        <w:rPr>
-          <w:i/>
-          <w:iCs/>
-        </w:rPr>
-        <w:t xml:space="preserve"> bottom</w:t>
+        <w:t>6 push bottom</w:t>
       </w:r>
     </w:p>
     <w:p>
@@ -2178,7 +1568,6 @@
           <w:iCs/>
         </w:rPr>
       </w:pPr>
-      <w:proofErr w:type="spellStart"/>
       <w:r>
         <w:rPr>
           <w:i/>
@@ -2186,7 +1575,6 @@
         </w:rPr>
         <w:t>protoboard</w:t>
       </w:r>
-      <w:proofErr w:type="spellEnd"/>
       <w:r>
         <w:rPr>
           <w:i/>
@@ -2197,13 +1585,8 @@
     </w:p>
     <w:p>
       <w:r>
-        <w:t xml:space="preserve">Ensamblado en el </w:t>
-      </w:r>
-      <w:proofErr w:type="spellStart"/>
-      <w:r>
-        <w:t>protoboard</w:t>
-      </w:r>
-      <w:proofErr w:type="spellEnd"/>
+        <w:t>Ensamblado en el protoboard</w:t>
+      </w:r>
     </w:p>
     <w:p>
       <w:r>
@@ -2211,7 +1594,7 @@
           <w:noProof/>
         </w:rPr>
         <w:drawing>
-          <wp:inline distT="0" distB="0" distL="0" distR="0" wp14:anchorId="548A42F6" wp14:editId="3B9E2FB7">
+          <wp:inline distT="0" distB="0" distL="0" distR="0" wp14:anchorId="548A42F6" wp14:editId="2277237C">
             <wp:extent cx="3898900" cy="2921965"/>
             <wp:effectExtent l="0" t="0" r="6350" b="0"/>
             <wp:docPr id="17" name="Picture 17"/>
@@ -2267,6 +1650,9 @@
     </w:p>
     <w:p>
       <w:r>
+        <w:rPr>
+          <w:noProof/>
+        </w:rPr>
         <w:drawing>
           <wp:inline distT="0" distB="0" distL="0" distR="0" wp14:anchorId="7844B303" wp14:editId="3CC2A53F">
             <wp:extent cx="4837430" cy="1949641"/>
@@ -2336,7 +1722,7 @@
           <w:noProof/>
         </w:rPr>
         <w:drawing>
-          <wp:inline distT="0" distB="0" distL="0" distR="0" wp14:anchorId="33FE1693" wp14:editId="6156EB05">
+          <wp:inline distT="0" distB="0" distL="0" distR="0" wp14:anchorId="33FE1693" wp14:editId="2A308550">
             <wp:extent cx="2059627" cy="3748726"/>
             <wp:effectExtent l="0" t="6350" r="0" b="0"/>
             <wp:docPr id="19" name="Picture 19" descr="A circuit board with wires and a blue wire"/>
@@ -2421,6 +1807,7 @@
         <w:rPr>
           <w:b/>
           <w:bCs/>
+          <w:noProof/>
         </w:rPr>
         <w:drawing>
           <wp:inline distT="0" distB="0" distL="0" distR="0" wp14:anchorId="760F73FD" wp14:editId="49E1A965">
@@ -2471,34 +1858,26 @@
           <w:bCs/>
         </w:rPr>
       </w:pPr>
-      <w:proofErr w:type="spellStart"/>
-      <w:r>
-        <w:rPr>
-          <w:b/>
-          <w:bCs/>
-        </w:rPr>
-        <w:t>Inseramos</w:t>
-      </w:r>
-      <w:proofErr w:type="spellEnd"/>
-      <w:r>
-        <w:rPr>
-          <w:b/>
-          <w:bCs/>
-        </w:rPr>
-        <w:t xml:space="preserve"> 5 pesos</w:t>
-      </w:r>
-    </w:p>
-    <w:p>
-      <w:pPr>
-        <w:rPr>
-          <w:b/>
-          <w:bCs/>
-        </w:rPr>
-      </w:pPr>
-      <w:r>
-        <w:rPr>
-          <w:b/>
-          <w:bCs/>
+      <w:r>
+        <w:rPr>
+          <w:b/>
+          <w:bCs/>
+        </w:rPr>
+        <w:t>Inseramos 5 pesos</w:t>
+      </w:r>
+    </w:p>
+    <w:p>
+      <w:pPr>
+        <w:rPr>
+          <w:b/>
+          <w:bCs/>
+        </w:rPr>
+      </w:pPr>
+      <w:r>
+        <w:rPr>
+          <w:b/>
+          <w:bCs/>
+          <w:noProof/>
         </w:rPr>
         <w:drawing>
           <wp:inline distT="0" distB="0" distL="0" distR="0" wp14:anchorId="50997DBF" wp14:editId="72DDD8B3">
@@ -2568,15 +1947,7 @@
         <w:jc w:val="both"/>
       </w:pPr>
       <w:r>
-        <w:t xml:space="preserve">al </w:t>
-      </w:r>
-      <w:proofErr w:type="spellStart"/>
-      <w:r>
-        <w:t>inserar</w:t>
-      </w:r>
-      <w:proofErr w:type="spellEnd"/>
-      <w:r>
-        <w:t xml:space="preserve"> la moneda de 10 me da el cambio</w:t>
+        <w:t>al inserar la moneda de 10 me da el cambio</w:t>
       </w:r>
       <w:r>
         <w:t xml:space="preserve"> que es de 1 peso</w:t>
@@ -2591,7 +1962,7 @@
           <w:noProof/>
         </w:rPr>
         <w:drawing>
-          <wp:inline distT="0" distB="0" distL="0" distR="0" wp14:anchorId="551C1233" wp14:editId="76A42BD4">
+          <wp:inline distT="0" distB="0" distL="0" distR="0" wp14:anchorId="551C1233" wp14:editId="16B49E7B">
             <wp:extent cx="3822700" cy="2298700"/>
             <wp:effectExtent l="0" t="0" r="6350" b="6350"/>
             <wp:docPr id="22" name="Picture 22" descr="A finger pointing at a circuit board"/>
@@ -2645,15 +2016,7 @@
         <w:jc w:val="both"/>
       </w:pPr>
       <w:r>
-        <w:t xml:space="preserve">El led azul indica las monedas de 1 peso, el led verde las de 5, el amarillo de 10 y el led rojo indica que se </w:t>
-      </w:r>
-      <w:proofErr w:type="spellStart"/>
-      <w:r>
-        <w:t>imprimio</w:t>
-      </w:r>
-      <w:proofErr w:type="spellEnd"/>
-      <w:r>
-        <w:t xml:space="preserve"> el boleto</w:t>
+        <w:t>El led azul indica las monedas de 1 peso, el led verde las de 5, el amarillo de 10 y el led rojo indica que se imprimio el boleto</w:t>
       </w:r>
     </w:p>
     <w:p>
@@ -2686,7 +2049,7 @@
           <w:noProof/>
         </w:rPr>
         <w:drawing>
-          <wp:inline distT="0" distB="0" distL="0" distR="0" wp14:anchorId="3B053568" wp14:editId="6F811EFB">
+          <wp:inline distT="0" distB="0" distL="0" distR="0" wp14:anchorId="3B053568" wp14:editId="760AC857">
             <wp:extent cx="3898900" cy="2355850"/>
             <wp:effectExtent l="0" t="0" r="6350" b="6350"/>
             <wp:docPr id="23" name="Picture 23" descr="A person holding a device with wires&#10;&#10;AI-generated content may be incorrect."/>
@@ -2774,6 +2137,9 @@
         <w:jc w:val="both"/>
       </w:pPr>
       <w:r>
+        <w:rPr>
+          <w:noProof/>
+        </w:rPr>
         <w:drawing>
           <wp:inline distT="0" distB="0" distL="0" distR="0" wp14:anchorId="15678486" wp14:editId="540D5E83">
             <wp:extent cx="2800350" cy="2565639"/>
@@ -2857,6 +2223,7 @@
         <w:rPr>
           <w:b/>
           <w:bCs/>
+          <w:noProof/>
         </w:rPr>
         <w:drawing>
           <wp:inline distT="0" distB="0" distL="0" distR="0" wp14:anchorId="0C7822F7" wp14:editId="34A0699A">
@@ -2971,7 +2338,7 @@
           <w:noProof/>
         </w:rPr>
         <w:drawing>
-          <wp:inline distT="0" distB="0" distL="0" distR="0" wp14:anchorId="2DF7A241" wp14:editId="4194A0A4">
+          <wp:inline distT="0" distB="0" distL="0" distR="0" wp14:anchorId="2DF7A241" wp14:editId="46E2635D">
             <wp:extent cx="2654155" cy="5742795"/>
             <wp:effectExtent l="0" t="1270" r="0" b="0"/>
             <wp:docPr id="26" name="Picture 26" descr="A finger pointing at a circuit board"/>
@@ -3024,7 +2391,7 @@
           <w:noProof/>
         </w:rPr>
         <w:drawing>
-          <wp:inline distT="0" distB="0" distL="0" distR="0" wp14:anchorId="30FB085F" wp14:editId="6D32DD98">
+          <wp:inline distT="0" distB="0" distL="0" distR="0" wp14:anchorId="30FB085F" wp14:editId="3A96D126">
             <wp:extent cx="2667215" cy="5771052"/>
             <wp:effectExtent l="0" t="8890" r="0" b="0"/>
             <wp:docPr id="27" name="Picture 27" descr="A person holding a circuit board"/>
@@ -3090,23 +2457,7 @@
           <w:bCs/>
         </w:rPr>
         <w:lastRenderedPageBreak/>
-        <w:t xml:space="preserve">Cambio de </w:t>
-      </w:r>
-      <w:proofErr w:type="spellStart"/>
-      <w:r>
-        <w:rPr>
-          <w:b/>
-          <w:bCs/>
-        </w:rPr>
-        <w:t>mas</w:t>
-      </w:r>
-      <w:proofErr w:type="spellEnd"/>
-      <w:r>
-        <w:rPr>
-          <w:b/>
-          <w:bCs/>
-        </w:rPr>
-        <w:t>:</w:t>
+        <w:t>Cambio de mas:</w:t>
       </w:r>
     </w:p>
     <w:p>
@@ -3121,6 +2472,9 @@
     </w:p>
     <w:p>
       <w:r>
+        <w:rPr>
+          <w:noProof/>
+        </w:rPr>
         <w:drawing>
           <wp:inline distT="0" distB="0" distL="0" distR="0" wp14:anchorId="38A32BF8" wp14:editId="03E96EEA">
             <wp:extent cx="3207291" cy="3594100"/>
@@ -3169,7 +2523,7 @@
           <w:noProof/>
         </w:rPr>
         <w:drawing>
-          <wp:inline distT="0" distB="0" distL="0" distR="0" wp14:anchorId="1FE80E88" wp14:editId="6D457E23">
+          <wp:inline distT="0" distB="0" distL="0" distR="0" wp14:anchorId="1FE80E88" wp14:editId="394C2E3E">
             <wp:extent cx="2539683" cy="5495112"/>
             <wp:effectExtent l="8255" t="0" r="2540" b="2540"/>
             <wp:docPr id="29" name="Picture 29" descr="A circuit board with wires and a device"/>
@@ -3224,7 +2578,7 @@
           <w:noProof/>
         </w:rPr>
         <w:drawing>
-          <wp:inline distT="0" distB="0" distL="0" distR="0" wp14:anchorId="775AEC0F" wp14:editId="0A56A032">
+          <wp:inline distT="0" distB="0" distL="0" distR="0" wp14:anchorId="775AEC0F" wp14:editId="45B48481">
             <wp:extent cx="2611813" cy="5651180"/>
             <wp:effectExtent l="4445" t="0" r="2540" b="2540"/>
             <wp:docPr id="30" name="Picture 30" descr="A finger pointing at a circuit board&#10;&#10;AI-generated content may be incorrect."/>
@@ -3277,7 +2631,7 @@
           <w:noProof/>
         </w:rPr>
         <w:drawing>
-          <wp:inline distT="0" distB="0" distL="0" distR="0" wp14:anchorId="76224C8B" wp14:editId="2831675A">
+          <wp:inline distT="0" distB="0" distL="0" distR="0" wp14:anchorId="76224C8B" wp14:editId="4E4B9C35">
             <wp:extent cx="2387283" cy="5165364"/>
             <wp:effectExtent l="1588" t="0" r="0" b="0"/>
             <wp:docPr id="31" name="Picture 31" descr="A person holding a circuit board"/>
@@ -3343,78 +2697,14 @@
       </w:r>
     </w:p>
     <w:p>
-      <w:proofErr w:type="spellStart"/>
-      <w:r>
-        <w:t>Disene</w:t>
-      </w:r>
-      <w:proofErr w:type="spellEnd"/>
-      <w:r>
-        <w:t xml:space="preserve"> e implemente el </w:t>
-      </w:r>
-      <w:proofErr w:type="spellStart"/>
-      <w:r>
-        <w:t>comportámiento</w:t>
-      </w:r>
-      <w:proofErr w:type="spellEnd"/>
-      <w:r>
-        <w:t xml:space="preserve"> de </w:t>
-      </w:r>
-      <w:proofErr w:type="spellStart"/>
-      <w:r>
-        <w:t>lá</w:t>
-      </w:r>
-      <w:proofErr w:type="spellEnd"/>
-      <w:r>
-        <w:t xml:space="preserve"> </w:t>
-      </w:r>
-      <w:proofErr w:type="spellStart"/>
-      <w:r>
-        <w:t>bárrerá</w:t>
-      </w:r>
-      <w:proofErr w:type="spellEnd"/>
-      <w:r>
-        <w:t xml:space="preserve"> de control </w:t>
-      </w:r>
-      <w:proofErr w:type="spellStart"/>
-      <w:r>
-        <w:t>vehiculár</w:t>
-      </w:r>
-      <w:proofErr w:type="spellEnd"/>
-      <w:r>
-        <w:t xml:space="preserve"> por medio de un</w:t>
+      <w:r>
+        <w:t>Disene e implemente el comportámiento de lá bárrerá de control vehiculár por medio de un</w:t>
       </w:r>
       <w:r>
         <w:t>a</w:t>
       </w:r>
       <w:r>
-        <w:t xml:space="preserve"> </w:t>
-      </w:r>
-      <w:r>
-        <w:t xml:space="preserve">máquina de estados. </w:t>
-      </w:r>
-      <w:proofErr w:type="spellStart"/>
-      <w:r>
-        <w:t>Lás</w:t>
-      </w:r>
-      <w:proofErr w:type="spellEnd"/>
-      <w:r>
-        <w:t xml:space="preserve"> </w:t>
-      </w:r>
-      <w:proofErr w:type="spellStart"/>
-      <w:r>
-        <w:t>ácciones</w:t>
-      </w:r>
-      <w:proofErr w:type="spellEnd"/>
-      <w:r>
-        <w:t xml:space="preserve"> que debe </w:t>
-      </w:r>
-      <w:proofErr w:type="spellStart"/>
-      <w:r>
-        <w:t>reálizár</w:t>
-      </w:r>
-      <w:proofErr w:type="spellEnd"/>
-      <w:r>
-        <w:t xml:space="preserve"> son:</w:t>
+        <w:t xml:space="preserve"> máquina de estados. Lás ácciones que debe reálizár son:</w:t>
       </w:r>
     </w:p>
     <w:p>
@@ -3426,114 +2716,7 @@
         </w:numPr>
       </w:pPr>
       <w:r>
-        <w:t xml:space="preserve">Si </w:t>
-      </w:r>
-      <w:proofErr w:type="spellStart"/>
-      <w:r>
-        <w:t>háy</w:t>
-      </w:r>
-      <w:proofErr w:type="spellEnd"/>
-      <w:r>
-        <w:t xml:space="preserve"> un </w:t>
-      </w:r>
-      <w:proofErr w:type="spellStart"/>
-      <w:r>
-        <w:t>cárro</w:t>
-      </w:r>
-      <w:proofErr w:type="spellEnd"/>
-      <w:r>
-        <w:t xml:space="preserve"> en </w:t>
-      </w:r>
-      <w:proofErr w:type="spellStart"/>
-      <w:r>
-        <w:t>esperá</w:t>
-      </w:r>
-      <w:proofErr w:type="spellEnd"/>
-      <w:r>
-        <w:t xml:space="preserve"> de </w:t>
-      </w:r>
-      <w:proofErr w:type="spellStart"/>
-      <w:r>
-        <w:t>cruzár</w:t>
-      </w:r>
-      <w:proofErr w:type="spellEnd"/>
-      <w:r>
-        <w:t xml:space="preserve"> </w:t>
-      </w:r>
-      <w:proofErr w:type="spellStart"/>
-      <w:r>
-        <w:t>lá</w:t>
-      </w:r>
-      <w:proofErr w:type="spellEnd"/>
-      <w:r>
-        <w:t xml:space="preserve"> </w:t>
-      </w:r>
-      <w:proofErr w:type="spellStart"/>
-      <w:r>
-        <w:t>bárrerá</w:t>
-      </w:r>
-      <w:proofErr w:type="spellEnd"/>
-      <w:r>
-        <w:t xml:space="preserve"> de control </w:t>
-      </w:r>
-      <w:proofErr w:type="spellStart"/>
-      <w:r>
-        <w:t>vehiculár</w:t>
-      </w:r>
-      <w:proofErr w:type="spellEnd"/>
-      <w:r>
-        <w:t xml:space="preserve">, está tiene que </w:t>
-      </w:r>
-      <w:proofErr w:type="spellStart"/>
-      <w:r>
-        <w:t>elevár</w:t>
-      </w:r>
-      <w:proofErr w:type="spellEnd"/>
-      <w:r>
-        <w:t xml:space="preserve"> l</w:t>
-      </w:r>
-      <w:r>
-        <w:t xml:space="preserve">a </w:t>
-      </w:r>
-      <w:proofErr w:type="spellStart"/>
-      <w:r>
-        <w:t>águjá</w:t>
-      </w:r>
-      <w:proofErr w:type="spellEnd"/>
-      <w:r>
-        <w:t xml:space="preserve"> </w:t>
-      </w:r>
-      <w:proofErr w:type="spellStart"/>
-      <w:r>
-        <w:t>hástá</w:t>
-      </w:r>
-      <w:proofErr w:type="spellEnd"/>
-      <w:r>
-        <w:t xml:space="preserve"> que este en </w:t>
-      </w:r>
-      <w:proofErr w:type="spellStart"/>
-      <w:r>
-        <w:t>lá</w:t>
-      </w:r>
-      <w:proofErr w:type="spellEnd"/>
-      <w:r>
-        <w:t xml:space="preserve"> </w:t>
-      </w:r>
-      <w:proofErr w:type="spellStart"/>
-      <w:r>
-        <w:t>posicion</w:t>
-      </w:r>
-      <w:proofErr w:type="spellEnd"/>
-      <w:r>
-        <w:t xml:space="preserve"> de </w:t>
-      </w:r>
-      <w:proofErr w:type="spellStart"/>
-      <w:r>
-        <w:t>árribá</w:t>
-      </w:r>
-      <w:proofErr w:type="spellEnd"/>
-      <w:r>
-        <w:t>.</w:t>
+        <w:t>Si háy un cárro en esperá de cruzár lá bárrerá de control vehiculár, está tiene que elevár la águjá hástá que este en lá posicion de árribá.</w:t>
       </w:r>
     </w:p>
     <w:p>
@@ -3545,83 +2728,19 @@
         </w:numPr>
       </w:pPr>
       <w:r>
+        <w:t xml:space="preserve"> Uná vez árribá, debe permánecer ásí hástá que el cárro </w:t>
+      </w:r>
+      <w:r>
+        <w:t>haya</w:t>
+      </w:r>
+      <w:r>
         <w:t xml:space="preserve"> </w:t>
       </w:r>
-      <w:proofErr w:type="spellStart"/>
-      <w:r>
-        <w:t>Uná</w:t>
-      </w:r>
-      <w:proofErr w:type="spellEnd"/>
-      <w:r>
-        <w:t xml:space="preserve"> vez </w:t>
-      </w:r>
-      <w:proofErr w:type="spellStart"/>
-      <w:r>
-        <w:t>árribá</w:t>
-      </w:r>
-      <w:proofErr w:type="spellEnd"/>
-      <w:r>
-        <w:t xml:space="preserve">, debe </w:t>
-      </w:r>
-      <w:proofErr w:type="spellStart"/>
-      <w:r>
-        <w:t>permánecer</w:t>
-      </w:r>
-      <w:proofErr w:type="spellEnd"/>
-      <w:r>
-        <w:t xml:space="preserve"> </w:t>
-      </w:r>
-      <w:proofErr w:type="spellStart"/>
-      <w:r>
-        <w:t>ásí</w:t>
-      </w:r>
-      <w:proofErr w:type="spellEnd"/>
-      <w:r>
-        <w:t xml:space="preserve"> </w:t>
-      </w:r>
-      <w:proofErr w:type="spellStart"/>
-      <w:r>
-        <w:t>hástá</w:t>
-      </w:r>
-      <w:proofErr w:type="spellEnd"/>
-      <w:r>
-        <w:t xml:space="preserve"> que el </w:t>
-      </w:r>
-      <w:proofErr w:type="spellStart"/>
-      <w:r>
-        <w:t>cárro</w:t>
-      </w:r>
-      <w:proofErr w:type="spellEnd"/>
-      <w:r>
-        <w:t xml:space="preserve"> </w:t>
-      </w:r>
-      <w:r>
-        <w:t>haya</w:t>
-      </w:r>
-      <w:r>
-        <w:t xml:space="preserve"> </w:t>
-      </w:r>
       <w:r>
         <w:t>cruzado</w:t>
       </w:r>
       <w:r>
-        <w:t xml:space="preserve"> </w:t>
-      </w:r>
-      <w:proofErr w:type="spellStart"/>
-      <w:r>
-        <w:t>lá</w:t>
-      </w:r>
-      <w:proofErr w:type="spellEnd"/>
-      <w:r>
-        <w:t xml:space="preserve"> </w:t>
-      </w:r>
-      <w:proofErr w:type="spellStart"/>
-      <w:r>
-        <w:t>bárrerá</w:t>
-      </w:r>
-      <w:proofErr w:type="spellEnd"/>
-      <w:r>
-        <w:t>.</w:t>
+        <w:t xml:space="preserve"> lá bárrerá.</w:t>
       </w:r>
     </w:p>
     <w:p>
@@ -3858,6 +2977,9 @@
     </w:p>
     <w:p>
       <w:r>
+        <w:rPr>
+          <w:noProof/>
+        </w:rPr>
         <w:drawing>
           <wp:inline distT="0" distB="0" distL="0" distR="0" wp14:anchorId="061A3B3B" wp14:editId="0FC16451">
             <wp:extent cx="3995198" cy="3028950"/>
@@ -3908,17 +3030,8 @@
           <w:bCs/>
         </w:rPr>
         <w:lastRenderedPageBreak/>
-        <w:t xml:space="preserve">Simulación en </w:t>
-      </w:r>
-      <w:proofErr w:type="spellStart"/>
-      <w:r>
-        <w:rPr>
-          <w:b/>
-          <w:bCs/>
-        </w:rPr>
-        <w:t>wokwi</w:t>
-      </w:r>
-      <w:proofErr w:type="spellEnd"/>
+        <w:t>Simulación en wokwi</w:t>
+      </w:r>
       <w:r>
         <w:rPr>
           <w:b/>
@@ -3942,6 +3055,9 @@
     </w:p>
     <w:p>
       <w:r>
+        <w:rPr>
+          <w:noProof/>
+        </w:rPr>
         <w:drawing>
           <wp:inline distT="0" distB="0" distL="0" distR="0" wp14:anchorId="2CE0770B" wp14:editId="03750C4C">
             <wp:extent cx="4250055" cy="3617692"/>
@@ -3986,6 +3102,9 @@
     </w:p>
     <w:p>
       <w:r>
+        <w:rPr>
+          <w:noProof/>
+        </w:rPr>
         <w:drawing>
           <wp:inline distT="0" distB="0" distL="0" distR="0" wp14:anchorId="393A7DBC" wp14:editId="48A44C4C">
             <wp:extent cx="5612130" cy="1548765"/>
@@ -4091,6 +3210,7 @@
         <w:rPr>
           <w:b/>
           <w:bCs/>
+          <w:noProof/>
         </w:rPr>
         <w:lastRenderedPageBreak/>
         <w:drawing>
@@ -4143,6 +3263,9 @@
     </w:p>
     <w:p>
       <w:r>
+        <w:rPr>
+          <w:noProof/>
+        </w:rPr>
         <w:drawing>
           <wp:inline distT="0" distB="0" distL="0" distR="0" wp14:anchorId="2CF85C75" wp14:editId="7DF7705D">
             <wp:extent cx="4202566" cy="3676650"/>
@@ -4226,15 +3349,7 @@
         <w:t xml:space="preserve"> paso </w:t>
       </w:r>
       <w:r>
-        <w:t xml:space="preserve">lo que </w:t>
-      </w:r>
-      <w:proofErr w:type="gramStart"/>
-      <w:r>
-        <w:t>bajara</w:t>
-      </w:r>
-      <w:proofErr w:type="gramEnd"/>
-      <w:r>
-        <w:t xml:space="preserve"> la aguja</w:t>
+        <w:t>lo que bajara la aguja</w:t>
       </w:r>
     </w:p>
     <w:p>
@@ -4263,6 +3378,9 @@
     </w:p>
     <w:p>
       <w:r>
+        <w:rPr>
+          <w:noProof/>
+        </w:rPr>
         <w:drawing>
           <wp:inline distT="0" distB="0" distL="0" distR="0" wp14:anchorId="22AF2EC8" wp14:editId="557CB556">
             <wp:extent cx="4164330" cy="3359075"/>
@@ -4326,6 +3444,9 @@
     </w:p>
     <w:p>
       <w:r>
+        <w:rPr>
+          <w:noProof/>
+        </w:rPr>
         <w:drawing>
           <wp:inline distT="0" distB="0" distL="0" distR="0" wp14:anchorId="2A36D644" wp14:editId="4C5EBB2C">
             <wp:extent cx="3781425" cy="3366401"/>
@@ -4394,7 +3515,7 @@
           <w:noProof/>
         </w:rPr>
         <w:drawing>
-          <wp:inline distT="0" distB="0" distL="0" distR="0" wp14:anchorId="7284D7F6" wp14:editId="27D52042">
+          <wp:inline distT="0" distB="0" distL="0" distR="0" wp14:anchorId="7284D7F6" wp14:editId="16A836D1">
             <wp:extent cx="4638675" cy="3479269"/>
             <wp:effectExtent l="0" t="0" r="0" b="6985"/>
             <wp:docPr id="39" name="Picture 39" descr="A circuit board with wires and wires"/>
@@ -4463,6 +3584,9 @@
     </w:p>
     <w:p>
       <w:r>
+        <w:rPr>
+          <w:noProof/>
+        </w:rPr>
         <w:drawing>
           <wp:inline distT="0" distB="0" distL="0" distR="0" wp14:anchorId="2F30B65E" wp14:editId="045FCE7E">
             <wp:extent cx="3704665" cy="2171700"/>
@@ -4540,6 +3664,7 @@
         <w:rPr>
           <w:b/>
           <w:bCs/>
+          <w:noProof/>
         </w:rPr>
         <w:drawing>
           <wp:inline distT="0" distB="0" distL="0" distR="0" wp14:anchorId="4568C293" wp14:editId="5EFD5DA3">
@@ -4608,6 +3733,9 @@
     </w:p>
     <w:p>
       <w:r>
+        <w:rPr>
+          <w:noProof/>
+        </w:rPr>
         <w:drawing>
           <wp:inline distT="0" distB="0" distL="0" distR="0" wp14:anchorId="45572302" wp14:editId="78DE27AF">
             <wp:extent cx="4257675" cy="1518175"/>
@@ -4683,7 +3811,7 @@
           <w:noProof/>
         </w:rPr>
         <w:drawing>
-          <wp:inline distT="0" distB="0" distL="0" distR="0" wp14:anchorId="58B6B060" wp14:editId="3EFA5652">
+          <wp:inline distT="0" distB="0" distL="0" distR="0" wp14:anchorId="58B6B060" wp14:editId="25ED2B70">
             <wp:extent cx="2724069" cy="5894068"/>
             <wp:effectExtent l="0" t="3810" r="0" b="0"/>
             <wp:docPr id="43" name="Picture 43" descr="A hand holding a blue light&#10;&#10;AI-generated content may be incorrect."/>
@@ -4749,7 +3877,7 @@
           <w:noProof/>
         </w:rPr>
         <w:drawing>
-          <wp:inline distT="0" distB="0" distL="0" distR="0" wp14:anchorId="78C0959A" wp14:editId="509F0A24">
+          <wp:inline distT="0" distB="0" distL="0" distR="0" wp14:anchorId="78C0959A" wp14:editId="36062CB0">
             <wp:extent cx="2798906" cy="6055993"/>
             <wp:effectExtent l="0" t="9207" r="0" b="0"/>
             <wp:docPr id="44" name="Picture 44" descr="A hand holding a blue light&#10;&#10;AI-generated content may be incorrect."/>
@@ -4871,6 +3999,9 @@
     </w:p>
     <w:p>
       <w:r>
+        <w:rPr>
+          <w:noProof/>
+        </w:rPr>
         <w:drawing>
           <wp:inline distT="0" distB="0" distL="0" distR="0" wp14:anchorId="0C438D92" wp14:editId="169AE3B2">
             <wp:extent cx="3496163" cy="2514951"/>
@@ -4933,7 +4064,7 @@
           <w:noProof/>
         </w:rPr>
         <w:drawing>
-          <wp:inline distT="0" distB="0" distL="0" distR="0" wp14:anchorId="7C03EE8A" wp14:editId="51311D88">
+          <wp:inline distT="0" distB="0" distL="0" distR="0" wp14:anchorId="7C03EE8A" wp14:editId="3D1A539B">
             <wp:extent cx="2887290" cy="6247228"/>
             <wp:effectExtent l="0" t="3810" r="5080" b="5080"/>
             <wp:docPr id="46" name="Picture 46" descr="A circuit board with wires and lights&#10;&#10;AI-generated content may be incorrect."/>
@@ -5023,7 +4154,7 @@
           <w:noProof/>
         </w:rPr>
         <w:drawing>
-          <wp:inline distT="0" distB="0" distL="0" distR="0" wp14:anchorId="61687CAD" wp14:editId="0BD53795">
+          <wp:inline distT="0" distB="0" distL="0" distR="0" wp14:anchorId="61687CAD" wp14:editId="4084AE2A">
             <wp:extent cx="4421505" cy="3316379"/>
             <wp:effectExtent l="0" t="0" r="0" b="0"/>
             <wp:docPr id="48" name="Picture 48" descr="A circuit board with wires and wires&#10;&#10;AI-generated content may be incorrect."/>
@@ -5177,15 +4308,7 @@
         <w:t>necesitaba</w:t>
       </w:r>
       <w:r>
-        <w:t xml:space="preserve"> para los </w:t>
-      </w:r>
-      <w:proofErr w:type="spellStart"/>
-      <w:r>
-        <w:t>GPIO’s</w:t>
-      </w:r>
-      <w:proofErr w:type="spellEnd"/>
-      <w:r>
-        <w:t xml:space="preserve"> de entrada, </w:t>
+        <w:t xml:space="preserve"> para los GPIO’s de entrada, </w:t>
       </w:r>
       <w:r>
         <w:t xml:space="preserve">pero de ahí en fue no </w:t>

</xml_diff>